<commit_message>
docs: use canonical tsanetgit/Zendesk_App slug; fix stale ZAF version
The repo was renamed Zendesk -> Zendesk_App (2026-06-17); tsanetgit/Zendesk
is the old slug that only redirects. Standardize every link and reference
on the canonical Zendesk_App across all docs and the implementation guide:

- README, ZAF/ZIS Quick Starts, SKILL, zaf-build/README, zis/README:
  all github.com/tsanetgit/Zendesk/... links -> .../Zendesk_App/...
  (this also reverts two links PR #46 changed the wrong way, and the new
  issue links it introduced with the old slug)
- Implementation Guide v2.11 docx: 9 prose/URL/clone references -> Zendesk_App
- zaf-build/README: "currently 1.0.36" -> 1.0.41 (matches manifest.json)

Canonical slug confirmed via API: repos/tsanetgit/Zendesk resolves to
full_name tsanetgit/Zendesk_App.

Co-Authored-By: Claude Opus 4.8 <noreply@anthropic.com>
</commit_message>
<xml_diff>
--- a/Zendesk_PlainLanguage_Implementation_Guide_v2.11.docx
+++ b/Zendesk_PlainLanguage_Implementation_Guide_v2.11.docx
@@ -824,7 +824,7 @@
                 <w:sz w:val="17"/>
                 <w:szCs w:val="17"/>
               </w:rPr>
-              <w:t xml:space="preserve">Known ZIS Limitations reconciled with the shipped state. Limitation 1 (ZIS bearer token expiring every 60 minutes) and Limitation 2 (ZIS inbound webhook requiring Basic Auth while TSANet sent only HMAC-SHA256) are now marked Resolved and validated end to end on Beta: ZIS authenticates to TSANet with Microsoft Entra client credentials and renews its own short-lived tokens, and inbound push delivery now works via TSANet’s new callbackAuth field (Connect API v3.1.0). Issues #1 and #2 in github.com/tsanetgit/Zendesk are closed. The Zendesk Views API custom-column behavior (now the one remaining Limitation 3) is unchanged. The former “Future Path — True Push Delivery via callbackAuth” section is retitled “Push Delivery via callbackAuth — Live on Beta” to reflect that direct push is live, with the ZAF background poller now a fallback and the Cloudflare Worker proxy documented as a secondary fallback only. No app or process change for members already on ZAF v1.0.41.</w:t>
+              <w:t xml:space="preserve">Known ZIS Limitations reconciled with the shipped state. Limitation 1 (ZIS bearer token expiring every 60 minutes) and Limitation 2 (ZIS inbound webhook requiring Basic Auth while TSANet sent only HMAC-SHA256) are now marked Resolved and validated end to end on Beta: ZIS authenticates to TSANet with Microsoft Entra client credentials and renews its own short-lived tokens, and inbound push delivery now works via TSANet’s new callbackAuth field (Connect API v3.1.0). Issues #1 and #2 in github.com/tsanetgit/Zendesk_App are closed. The Zendesk Views API custom-column behavior (now the one remaining Limitation 3) is unchanged. The former “Future Path — True Push Delivery via callbackAuth” section is retitled “Push Delivery via callbackAuth — Live on Beta” to reflect that direct push is live, with the ZAF background poller now a fallback and the Cloudflare Worker proxy documented as a secondary fallback only. No app or process change for members already on ZAF v1.0.41.</w:t>
             </w:r>
           </w:p>
         </w:tc>
@@ -1056,7 +1056,7 @@
                 <w:sz w:val="17"/>
                 <w:szCs w:val="17"/>
               </w:rPr>
-              <w:t xml:space="preserve">ZAF app updated to v1.0.31 — picklist custom fields now render their options correctly (values are newline-separated, not comma-separated), partner instructions (admin notes) render formatted text and clickable links safely instead of raw HTML tags, and the background poller checks every minute instead of every five. ZIS connection modernized: ZIS now authenticates to TSANet with Microsoft Entra client credentials and mints/renews its own short-lived tokens (validated in TSANet’s development environment; rolling out through Beta to Production), retiring the bearer-token + GitHub Actions refresh workaround. The ZIS flow bundle (event-driven ping-then-pull) is published in the repo under zis/ with its own deploy guide; the SLA monitor is now documented as optional (TSANet enforces only the creation-to-acknowledgment SLA, server-side). ZAF releases are packaged automatically: pushing a version tag builds the installable ZIP and attaches it to a GitHub Release. All repository references updated to github.com/tsanetgit/Zendesk, the canonical source (older personal repos are archived).</w:t>
+              <w:t xml:space="preserve">ZAF app updated to v1.0.31 — picklist custom fields now render their options correctly (values are newline-separated, not comma-separated), partner instructions (admin notes) render formatted text and clickable links safely instead of raw HTML tags, and the background poller checks every minute instead of every five. ZIS connection modernized: ZIS now authenticates to TSANet with Microsoft Entra client credentials and mints/renews its own short-lived tokens (validated in TSANet’s development environment; rolling out through Beta to Production), retiring the bearer-token + GitHub Actions refresh workaround. The ZIS flow bundle (event-driven ping-then-pull) is published in the repo under zis/ with its own deploy guide; the SLA monitor is now documented as optional (TSANet enforces only the creation-to-acknowledgment SLA, server-side). ZAF releases are packaged automatically: pushing a version tag builds the installable ZIP and attaches it to a GitHub Release. All repository references updated to github.com/tsanetgit/Zendesk_App, the canonical source (older personal repos are archived).</w:t>
             </w:r>
           </w:p>
         </w:tc>
@@ -11611,7 +11611,7 @@
           <w:szCs w:val="20"/>
           <w:lang w:val="en-US"/>
         </w:rPr>
-        <w:t>Resolved. ZIS now authenticates to TSANet with Microsoft Entra client credentials: ZIS stores a long-lived client credential issued by TSANet and mints and renews its own short-lived tokens itself, so there is no static token left to expire. This has been validated end to end on TSANet’s Beta environment, and issue #1 in the github.com/tsanetgit/Zendesk repo is closed. Historical context: the old approach stored a TSANet JWT (which expires after 60 minutes) in a ZIS bearer connection and kept it alive with a twice-hourly GitHub Actions refresh job. That workaround is retired — do not build it for a new installation; follow the ZIS Quick Start, which documents only the client-credentials method.</w:t>
+        <w:t>Resolved. ZIS now authenticates to TSANet with Microsoft Entra client credentials: ZIS stores a long-lived client credential issued by TSANet and mints and renews its own short-lived tokens itself, so there is no static token left to expire. This has been validated end to end on TSANet’s Beta environment, and issue #1 in the github.com/tsanetgit/Zendesk_App repo is closed. Historical context: the old approach stored a TSANet JWT (which expires after 60 minutes) in a ZIS bearer connection and kept it alive with a twice-hourly GitHub Actions refresh job. That workaround is retired — do not build it for a new installation; follow the ZIS Quick Start, which documents only the client-credentials method.</w:t>
       </w:r>
     </w:p>
     <w:p xmlns:wp14="http://schemas.microsoft.com/office/word/2010/wordml" wp14:textId="77777777">
@@ -11647,7 +11647,7 @@
           <w:szCs w:val="20"/>
           <w:lang w:val="en-US"/>
         </w:rPr>
-        <w:t>Resolved. TSANet’s webhook registration API now supports an optional callbackAuth field (delivered in Connect API v3.1.0). A member registers their ZIS ingest URL as a webhook subscription with a callbackAuth of type BASIC carrying the ingest credentials; TSANet then attaches that Basic Auth header on every POST — alongside the HMAC-SHA256 signature — and ZIS accepts the delivery. This was validated end to end on TSANet’s Beta environment: authenticated inbound deliveries return HTTP 200 and create exactly one Zendesk ticket per case, and issue #2 in the github.com/tsanetgit/Zendesk repo is closed. The Zendesk-side receiver is the ZIS inbound webhook plus the event-driven flow bundle published under zis/ in the repo, which pulls the full case from TSANet and creates or updates the matching ticket. Historical context: ZIS inbound webhooks require HTTP Basic Auth on every POST, but TSANet’s webhook system previously sent only an HMAC-SHA256 signature with no way to attach a Basic Auth header, so direct delivery to a ZIS ingest URL returned 401. The ZAF background poller covered inbound in the interim; it now runs only as a fallback behind direct push, and inbound ticket creation is idempotent (deduped per case), so push and poller never create duplicate tickets.</w:t>
+        <w:t>Resolved. TSANet’s webhook registration API now supports an optional callbackAuth field (delivered in Connect API v3.1.0). A member registers their ZIS ingest URL as a webhook subscription with a callbackAuth of type BASIC carrying the ingest credentials; TSANet then attaches that Basic Auth header on every POST — alongside the HMAC-SHA256 signature — and ZIS accepts the delivery. This was validated end to end on TSANet’s Beta environment: authenticated inbound deliveries return HTTP 200 and create exactly one Zendesk ticket per case, and issue #2 in the github.com/tsanetgit/Zendesk_App repo is closed. The Zendesk-side receiver is the ZIS inbound webhook plus the event-driven flow bundle published under zis/ in the repo, which pulls the full case from TSANet and creates or updates the matching ticket. Historical context: ZIS inbound webhooks require HTTP Basic Auth on every POST, but TSANet’s webhook system previously sent only an HMAC-SHA256 signature with no way to attach a Basic Auth header, so direct delivery to a ZIS ingest URL returned 401. The ZAF background poller covered inbound in the interim; it now runs only as a fallback behind direct push, and inbound ticket creation is idempotent (deduped per case), so push and poller never create duplicate tickets.</w:t>
       </w:r>
     </w:p>
     <w:p xmlns:wp14="http://schemas.microsoft.com/office/word/2010/wordml" wp14:textId="77777777">
@@ -12375,7 +12375,7 @@
           <w:szCs w:val="20"/>
           <w:lang w:val="en-US"/>
         </w:rPr>
-        <w:t>Create a GitHub repository (free account is fine — public or private both work). The reference workflow lives in the ZIS Quick Start at github.com/tsanetgit/Zendesk.</w:t>
+        <w:t>Create a GitHub repository (free account is fine — public or private both work). The reference workflow lives in the ZIS Quick Start at github.com/tsanetgit/Zendesk_App.</w:t>
       </w:r>
     </w:p>
     <w:p xmlns:wp14="http://schemas.microsoft.com/office/word/2010/wordml" wp14:textId="77777777">
@@ -12644,7 +12644,7 @@
           <w:szCs w:val="20"/>
           <w:lang w:val="en-US"/>
         </w:rPr>
-        <w:t>The file lives at github.com/tsanetgit/Zendesk/blob/main/SKILL_TSANet_Connect.md. It is a plain Markdown file — review it before you use it. Skills are not magic; they bias the assistant toward the patterns that have already been tested in production and away from the dead ends that wasted weeks the first time around.</w:t>
+        <w:t>The file lives at github.com/tsanetgit/Zendesk_App/blob/main/SKILL_TSANet_Connect.md. It is a plain Markdown file — review it before you use it. Skills are not magic; they bias the assistant toward the patterns that have already been tested in production and away from the dead ends that wasted weeks the first time around.</w:t>
       </w:r>
     </w:p>
     <w:p xmlns:wp14="http://schemas.microsoft.com/office/word/2010/wordml" wp14:textId="77777777">
@@ -13314,7 +13314,7 @@
           <w:szCs w:val="20"/>
           <w:lang w:val="en-US"/>
         </w:rPr>
-        <w:t>The app lives in the TSANet GitHub repo at: github.com/tsanetgit/Zendesk (directory: zaf-build)</w:t>
+        <w:t>The app lives in the TSANet GitHub repo at: github.com/tsanetgit/Zendesk_App (directory: zaf-build)</w:t>
       </w:r>
     </w:p>
     <w:tbl>
@@ -16510,7 +16510,7 @@
                 <w:sz w:val="17"/>
                 <w:szCs w:val="17"/>
               </w:rPr>
-              <w:t xml:space="preserve">git clone https://github.com/tsanetgit/Zendesk.git</w:t>
+              <w:t xml:space="preserve">git clone https://github.com/tsanetgit/Zendesk_App.git</w:t>
             </w:r>
           </w:p>
           <w:p wp14:textId="77777777">
@@ -25406,7 +25406,7 @@
           <w:szCs w:val="19"/>
           <w:lang w:val="en-US"/>
         </w:rPr>
-        <w:t>connect.tsanet.org  |  membership@tsanet.org  |  github.com/tsanetgit/Zendesk</w:t>
+        <w:t>connect.tsanet.org  |  membership@tsanet.org  |  github.com/tsanetgit/Zendesk_App</w:t>
       </w:r>
     </w:p>
     <w:sectPr>

</xml_diff>